<commit_message>
docs: alinha o capitulo 20 do documento com o README
O documento ainda chamava a secao de limitacoes conhecidas enquanto o README ja
tratava o mesmo assunto como analise quantitativa, e a banca pode ler o
documento sem abrir o README.

Capitulo 20 passa a se chamar Balanco hidrico e regime de escassez, com a mesma
tabela de 19,6 contra 87,8 pontos percentuais por dia, a mesma leitura de fazenda
subdimensionada para irrigacao plena e dimensionamento como decisao agronomica,
e a calibragem alternativa registrada.

A ressalva de que a priorizacao por criticidade nao elimina o deficit entra nos
dois lugares: no capitulo 20 e no item correspondente da evolucao futura.

Co-Authored-By: Claude Opus 5 <noreply@anthropic.com>
</commit_message>
<xml_diff>
--- a/docs/BIOSOLAR HACKUFRA.docx
+++ b/docs/BIOSOLAR HACKUFRA.docx
@@ -12541,7 +12541,7 @@
           <w:sz w:val="30"/>
           <w:szCs w:val="30"/>
         </w:rPr>
-        <w:t xml:space="preserve">20. Limitações conhecidas</w:t>
+        <w:t xml:space="preserve">20. Balanço hídrico e regime de escassez</w:t>
       </w:r>
     </w:p>
     <w:p>
@@ -12554,7 +12554,428 @@
           <w:sz w:val="22"/>
           <w:szCs w:val="22"/>
         </w:rPr>
-        <w:t xml:space="preserve">Irrigação sem priorização. O sistema trata todos os talhões com igualdade. Quando o bloqueio é liberado, todos os talhões abaixo do gatilho crítico são irrigados ao mesmo tempo, o que consome o reservatório depressa e pode levá-lo de volta ao bloqueio em poucos ciclos. É o comportamento correto diante das regras escritas, mas não é o ideal em escassez.</w:t>
+        <w:t xml:space="preserve">O reservatório opera em déficit, e isso não é acidente de calibragem, é o cenário que o caderno descreve. Durante a estiagem a demanda de irrigação de um pomar supera com folga o que a captação solar consegue repor, e a medição abaixo quantifica exatamente isso.</w:t>
+      </w:r>
+    </w:p>
+    <w:p>
+      <w:pPr>
+        <w:spacing w:after="120" w:line="300"/>
+      </w:pPr>
+      <w:r>
+        <w:rPr>
+          <w:rFonts w:ascii="Calibri" w:cs="Calibri" w:eastAsia="Calibri" w:hAnsi="Calibri"/>
+          <w:sz w:val="22"/>
+          <w:szCs w:val="22"/>
+        </w:rPr>
+        <w:t xml:space="preserve">Cada talhão precisa de bomba durante 28,6% do tempo para se manter na faixa segura, porque a umidade sobe 3,0 por ciclo irrigando e cai 1,2 por ciclo sem irrigação. Com quatro talhões, isso dá 1,14 bombas ligadas em média, de forma contínua.</w:t>
+      </w:r>
+    </w:p>
+    <w:tbl>
+      <w:tblPr>
+        <w:tblW w:type="dxa" w:w="9000"/>
+        <w:tblBorders>
+          <w:top w:val="single" w:color="auto" w:sz="4"/>
+          <w:left w:val="single" w:color="auto" w:sz="4"/>
+          <w:bottom w:val="single" w:color="auto" w:sz="4"/>
+          <w:right w:val="single" w:color="auto" w:sz="4"/>
+          <w:insideH w:val="single" w:color="auto" w:sz="4"/>
+          <w:insideV w:val="single" w:color="auto" w:sz="4"/>
+        </w:tblBorders>
+      </w:tblPr>
+      <w:tblGrid>
+        <w:gridCol w:w="1400"/>
+        <w:gridCol w:w="2600"/>
+        <w:gridCol w:w="5000"/>
+      </w:tblGrid>
+      <w:tr>
+        <w:trPr>
+          <w:tblHeader/>
+        </w:trPr>
+        <w:tc>
+          <w:tcPr>
+            <w:tcW w:type="dxa" w:w="1400"/>
+            <w:shd w:fill="D9822B" w:val="clear"/>
+            <w:tcMar>
+              <w:top w:type="dxa" w:w="80"/>
+              <w:left w:type="dxa" w:w="120"/>
+              <w:bottom w:type="dxa" w:w="80"/>
+              <w:right w:type="dxa" w:w="120"/>
+            </w:tcMar>
+          </w:tcPr>
+          <w:p>
+            <w:pPr>
+              <w:spacing w:after="0" w:line="280"/>
+            </w:pPr>
+            <w:r>
+              <w:rPr>
+                <w:rFonts w:ascii="Calibri" w:cs="Calibri" w:eastAsia="Calibri" w:hAnsi="Calibri"/>
+                <w:b/>
+                <w:bCs/>
+                <w:color w:val="FFFFFF"/>
+                <w:sz w:val="20"/>
+                <w:szCs w:val="20"/>
+              </w:rPr>
+              <w:t xml:space="preserve"/>
+            </w:r>
+          </w:p>
+        </w:tc>
+        <w:tc>
+          <w:tcPr>
+            <w:tcW w:type="dxa" w:w="2600"/>
+            <w:shd w:fill="D9822B" w:val="clear"/>
+            <w:tcMar>
+              <w:top w:type="dxa" w:w="80"/>
+              <w:left w:type="dxa" w:w="120"/>
+              <w:bottom w:type="dxa" w:w="80"/>
+              <w:right w:type="dxa" w:w="120"/>
+            </w:tcMar>
+          </w:tcPr>
+          <w:p>
+            <w:pPr>
+              <w:spacing w:after="0" w:line="280"/>
+            </w:pPr>
+            <w:r>
+              <w:rPr>
+                <w:rFonts w:ascii="Calibri" w:cs="Calibri" w:eastAsia="Calibri" w:hAnsi="Calibri"/>
+                <w:b/>
+                <w:bCs/>
+                <w:color w:val="FFFFFF"/>
+                <w:sz w:val="20"/>
+                <w:szCs w:val="20"/>
+              </w:rPr>
+              <w:t xml:space="preserve">Cálculo</w:t>
+            </w:r>
+          </w:p>
+        </w:tc>
+        <w:tc>
+          <w:tcPr>
+            <w:tcW w:type="dxa" w:w="5000"/>
+            <w:shd w:fill="D9822B" w:val="clear"/>
+            <w:tcMar>
+              <w:top w:type="dxa" w:w="80"/>
+              <w:left w:type="dxa" w:w="120"/>
+              <w:bottom w:type="dxa" w:w="80"/>
+              <w:right w:type="dxa" w:w="120"/>
+            </w:tcMar>
+          </w:tcPr>
+          <w:p>
+            <w:pPr>
+              <w:spacing w:after="0" w:line="280"/>
+            </w:pPr>
+            <w:r>
+              <w:rPr>
+                <w:rFonts w:ascii="Calibri" w:cs="Calibri" w:eastAsia="Calibri" w:hAnsi="Calibri"/>
+                <w:b/>
+                <w:bCs/>
+                <w:color w:val="FFFFFF"/>
+                <w:sz w:val="20"/>
+                <w:szCs w:val="20"/>
+              </w:rPr>
+              <w:t xml:space="preserve">Pontos percentuais por dia</w:t>
+            </w:r>
+          </w:p>
+        </w:tc>
+      </w:tr>
+      <w:tr>
+        <w:tc>
+          <w:tcPr>
+            <w:tcW w:type="dxa" w:w="1400"/>
+            <w:tcMar>
+              <w:top w:type="dxa" w:w="80"/>
+              <w:left w:type="dxa" w:w="120"/>
+              <w:bottom w:type="dxa" w:w="80"/>
+              <w:right w:type="dxa" w:w="120"/>
+            </w:tcMar>
+          </w:tcPr>
+          <w:p>
+            <w:pPr>
+              <w:spacing w:after="0" w:line="280"/>
+            </w:pPr>
+            <w:r>
+              <w:rPr>
+                <w:rFonts w:ascii="Calibri" w:cs="Calibri" w:eastAsia="Calibri" w:hAnsi="Calibri"/>
+                <w:b w:val="false"/>
+                <w:bCs w:val="false"/>
+                <w:color w:val="000000"/>
+                <w:sz w:val="20"/>
+                <w:szCs w:val="20"/>
+              </w:rPr>
+              <w:t xml:space="preserve">Captação solar</w:t>
+            </w:r>
+          </w:p>
+        </w:tc>
+        <w:tc>
+          <w:tcPr>
+            <w:tcW w:type="dxa" w:w="2600"/>
+            <w:tcMar>
+              <w:top w:type="dxa" w:w="80"/>
+              <w:left w:type="dxa" w:w="120"/>
+              <w:bottom w:type="dxa" w:w="80"/>
+              <w:right w:type="dxa" w:w="120"/>
+            </w:tcMar>
+          </w:tcPr>
+          <w:p>
+            <w:pPr>
+              <w:spacing w:after="0" w:line="280"/>
+            </w:pPr>
+            <w:r>
+              <w:rPr>
+                <w:rFonts w:ascii="Calibri" w:cs="Calibri" w:eastAsia="Calibri" w:hAnsi="Calibri"/>
+                <w:b w:val="false"/>
+                <w:bCs w:val="false"/>
+                <w:color w:val="000000"/>
+                <w:sz w:val="20"/>
+                <w:szCs w:val="20"/>
+              </w:rPr>
+              <w:t xml:space="preserve">0,64 x média do seno x 48 ciclos de sol</w:t>
+            </w:r>
+          </w:p>
+        </w:tc>
+        <w:tc>
+          <w:tcPr>
+            <w:tcW w:type="dxa" w:w="5000"/>
+            <w:tcMar>
+              <w:top w:type="dxa" w:w="80"/>
+              <w:left w:type="dxa" w:w="120"/>
+              <w:bottom w:type="dxa" w:w="80"/>
+              <w:right w:type="dxa" w:w="120"/>
+            </w:tcMar>
+          </w:tcPr>
+          <w:p>
+            <w:pPr>
+              <w:spacing w:after="0" w:line="280"/>
+            </w:pPr>
+            <w:r>
+              <w:rPr>
+                <w:rFonts w:ascii="Calibri" w:cs="Calibri" w:eastAsia="Calibri" w:hAnsi="Calibri"/>
+                <w:b w:val="false"/>
+                <w:bCs w:val="false"/>
+                <w:color w:val="000000"/>
+                <w:sz w:val="20"/>
+                <w:szCs w:val="20"/>
+              </w:rPr>
+              <w:t xml:space="preserve">19,6</w:t>
+            </w:r>
+          </w:p>
+        </w:tc>
+      </w:tr>
+      <w:tr>
+        <w:tc>
+          <w:tcPr>
+            <w:tcW w:type="dxa" w:w="1400"/>
+            <w:tcMar>
+              <w:top w:type="dxa" w:w="80"/>
+              <w:left w:type="dxa" w:w="120"/>
+              <w:bottom w:type="dxa" w:w="80"/>
+              <w:right w:type="dxa" w:w="120"/>
+            </w:tcMar>
+          </w:tcPr>
+          <w:p>
+            <w:pPr>
+              <w:spacing w:after="0" w:line="280"/>
+            </w:pPr>
+            <w:r>
+              <w:rPr>
+                <w:rFonts w:ascii="Calibri" w:cs="Calibri" w:eastAsia="Calibri" w:hAnsi="Calibri"/>
+                <w:b w:val="false"/>
+                <w:bCs w:val="false"/>
+                <w:color w:val="000000"/>
+                <w:sz w:val="20"/>
+                <w:szCs w:val="20"/>
+              </w:rPr>
+              <w:t xml:space="preserve">Consumo da irrigação</w:t>
+            </w:r>
+          </w:p>
+        </w:tc>
+        <w:tc>
+          <w:tcPr>
+            <w:tcW w:type="dxa" w:w="2600"/>
+            <w:tcMar>
+              <w:top w:type="dxa" w:w="80"/>
+              <w:left w:type="dxa" w:w="120"/>
+              <w:bottom w:type="dxa" w:w="80"/>
+              <w:right w:type="dxa" w:w="120"/>
+            </w:tcMar>
+          </w:tcPr>
+          <w:p>
+            <w:pPr>
+              <w:spacing w:after="0" w:line="280"/>
+            </w:pPr>
+            <w:r>
+              <w:rPr>
+                <w:rFonts w:ascii="Calibri" w:cs="Calibri" w:eastAsia="Calibri" w:hAnsi="Calibri"/>
+                <w:b w:val="false"/>
+                <w:bCs w:val="false"/>
+                <w:color w:val="000000"/>
+                <w:sz w:val="20"/>
+                <w:szCs w:val="20"/>
+              </w:rPr>
+              <w:t xml:space="preserve">1,14 bombas x 0,8 x 96 ciclos</w:t>
+            </w:r>
+          </w:p>
+        </w:tc>
+        <w:tc>
+          <w:tcPr>
+            <w:tcW w:type="dxa" w:w="5000"/>
+            <w:tcMar>
+              <w:top w:type="dxa" w:w="80"/>
+              <w:left w:type="dxa" w:w="120"/>
+              <w:bottom w:type="dxa" w:w="80"/>
+              <w:right w:type="dxa" w:w="120"/>
+            </w:tcMar>
+          </w:tcPr>
+          <w:p>
+            <w:pPr>
+              <w:spacing w:after="0" w:line="280"/>
+            </w:pPr>
+            <w:r>
+              <w:rPr>
+                <w:rFonts w:ascii="Calibri" w:cs="Calibri" w:eastAsia="Calibri" w:hAnsi="Calibri"/>
+                <w:b w:val="false"/>
+                <w:bCs w:val="false"/>
+                <w:color w:val="000000"/>
+                <w:sz w:val="20"/>
+                <w:szCs w:val="20"/>
+              </w:rPr>
+              <w:t xml:space="preserve">87,8</w:t>
+            </w:r>
+          </w:p>
+        </w:tc>
+      </w:tr>
+      <w:tr>
+        <w:tc>
+          <w:tcPr>
+            <w:tcW w:type="dxa" w:w="1400"/>
+            <w:tcMar>
+              <w:top w:type="dxa" w:w="80"/>
+              <w:left w:type="dxa" w:w="120"/>
+              <w:bottom w:type="dxa" w:w="80"/>
+              <w:right w:type="dxa" w:w="120"/>
+            </w:tcMar>
+          </w:tcPr>
+          <w:p>
+            <w:pPr>
+              <w:spacing w:after="0" w:line="280"/>
+            </w:pPr>
+            <w:r>
+              <w:rPr>
+                <w:rFonts w:ascii="Calibri" w:cs="Calibri" w:eastAsia="Calibri" w:hAnsi="Calibri"/>
+                <w:b w:val="false"/>
+                <w:bCs w:val="false"/>
+                <w:color w:val="000000"/>
+                <w:sz w:val="20"/>
+                <w:szCs w:val="20"/>
+              </w:rPr>
+              <w:t xml:space="preserve">Saldo</w:t>
+            </w:r>
+          </w:p>
+        </w:tc>
+        <w:tc>
+          <w:tcPr>
+            <w:tcW w:type="dxa" w:w="2600"/>
+            <w:tcMar>
+              <w:top w:type="dxa" w:w="80"/>
+              <w:left w:type="dxa" w:w="120"/>
+              <w:bottom w:type="dxa" w:w="80"/>
+              <w:right w:type="dxa" w:w="120"/>
+            </w:tcMar>
+          </w:tcPr>
+          <w:p>
+            <w:pPr>
+              <w:spacing w:after="0" w:line="280"/>
+            </w:pPr>
+            <w:r>
+              <w:rPr>
+                <w:rFonts w:ascii="Calibri" w:cs="Calibri" w:eastAsia="Calibri" w:hAnsi="Calibri"/>
+                <w:b w:val="false"/>
+                <w:bCs w:val="false"/>
+                <w:color w:val="000000"/>
+                <w:sz w:val="20"/>
+                <w:szCs w:val="20"/>
+              </w:rPr>
+              <w:t xml:space="preserve"/>
+            </w:r>
+          </w:p>
+        </w:tc>
+        <w:tc>
+          <w:tcPr>
+            <w:tcW w:type="dxa" w:w="5000"/>
+            <w:tcMar>
+              <w:top w:type="dxa" w:w="80"/>
+              <w:left w:type="dxa" w:w="120"/>
+              <w:bottom w:type="dxa" w:w="80"/>
+              <w:right w:type="dxa" w:w="120"/>
+            </w:tcMar>
+          </w:tcPr>
+          <w:p>
+            <w:pPr>
+              <w:spacing w:after="0" w:line="280"/>
+            </w:pPr>
+            <w:r>
+              <w:rPr>
+                <w:rFonts w:ascii="Calibri" w:cs="Calibri" w:eastAsia="Calibri" w:hAnsi="Calibri"/>
+                <w:b w:val="false"/>
+                <w:bCs w:val="false"/>
+                <w:color w:val="000000"/>
+                <w:sz w:val="20"/>
+                <w:szCs w:val="20"/>
+              </w:rPr>
+              <w:t xml:space="preserve">-68,2</w:t>
+            </w:r>
+          </w:p>
+        </w:tc>
+      </w:tr>
+    </w:tbl>
+    <w:p>
+      <w:pPr>
+        <w:spacing w:after="120" w:line="300"/>
+      </w:pPr>
+      <w:r>
+        <w:rPr>
+          <w:rFonts w:ascii="Calibri" w:cs="Calibri" w:eastAsia="Calibri" w:hAnsi="Calibri"/>
+          <w:sz w:val="22"/>
+          <w:szCs w:val="22"/>
+        </w:rPr>
+        <w:t xml:space="preserve">O consumo é cerca de 4,5 vezes a captação. O único momento em que o nível sobe é durante o bloqueio, com todas as bombas desligadas, e por isso o sistema se estabiliza oscilando entre quinze e vinte e cinco por cento, que é o único equilíbrio possível com esta fazenda. Observado em execução: o bloqueio é liberado quando a captação leva o nível aos vinte e cinco por cento, as quatro bombas ligam de uma vez nos talhões secos e derrubam onze pontos em uma hora simulada, e o bloqueio volta. À noite o nível fica parado, porque a captação é solar.</w:t>
+      </w:r>
+    </w:p>
+    <w:p>
+      <w:pPr>
+        <w:spacing w:after="120" w:line="300"/>
+      </w:pPr>
+      <w:r>
+        <w:rPr>
+          <w:rFonts w:ascii="Calibri" w:cs="Calibri" w:eastAsia="Calibri" w:hAnsi="Calibri"/>
+          <w:sz w:val="22"/>
+          <w:szCs w:val="22"/>
+        </w:rPr>
+        <w:t xml:space="preserve">A fazenda é subdimensionada para irrigação plena. Dimensionar reservatório e captação para a demanda do pomar é decisão de projeto agronômico, não de software, porque envolve área irrigada, cultura, evapotranspiração local e orçamento de painel solar. O papel do sistema de automação diante de uma fazenda assim é exatamente o que ele faz, que é impedir que o reservatório zere, irrigando enquanto há água e travando tudo quando não há.</w:t>
+      </w:r>
+    </w:p>
+    <w:p>
+      <w:pPr>
+        <w:spacing w:after="120" w:line="300"/>
+      </w:pPr>
+      <w:r>
+        <w:rPr>
+          <w:rFonts w:ascii="Calibri" w:cs="Calibri" w:eastAsia="Calibri" w:hAnsi="Calibri"/>
+          <w:sz w:val="22"/>
+          <w:szCs w:val="22"/>
+        </w:rPr>
+        <w:t xml:space="preserve">Uma calibragem alternativa, se o objetivo fosse um cenário que se recupera em vez de oscilar, seria mexer no estado inicial em vez das taxas: partir de talhões bem secos para o bloqueio acontecer logo no começo, e reduzir o consumo por bomba para que a fazenda se sustente depois disso. Os números atuais foram escolhidos para que o bloqueio aconteça de forma confiável na demonstração.</w:t>
+      </w:r>
+    </w:p>
+    <w:p>
+      <w:pPr>
+        <w:spacing w:after="120" w:line="300"/>
+      </w:pPr>
+      <w:r>
+        <w:rPr>
+          <w:rFonts w:ascii="Calibri" w:cs="Calibri" w:eastAsia="Calibri" w:hAnsi="Calibri"/>
+          <w:sz w:val="22"/>
+          <w:szCs w:val="22"/>
+        </w:rPr>
+        <w:t xml:space="preserve">Irrigação sem priorização. O sistema trata todos os talhões com igualdade, então quando o bloqueio é liberado todos os que estiverem abaixo do gatilho são irrigados ao mesmo tempo. Uma regra de priorização por criticidade suavizaria a queda, mas não elimina o déficit: como a manutenção dos quatro talhões exige 1,14 bombas em média, uma bomba de cada vez não dá conta do pomar inteiro. O problema é de dimensionamento, e a priorização trata do sintoma.</w:t>
       </w:r>
     </w:p>
     <w:p>
@@ -12610,7 +13031,7 @@
           <w:sz w:val="22"/>
           <w:szCs w:val="22"/>
         </w:rPr>
-        <w:t xml:space="preserve">Priorização por criticidade. Abaixo de um patamar de conforto do reservatório, irrigar apenas o talhão mais seco por vez em vez de todos juntos. Entraria como mais uma função no mesmo módulo de regras, avaliada antes da irrigação crítica, sem tocar em transporte nem em interface.</w:t>
+        <w:t xml:space="preserve">Priorização por criticidade. Abaixo de um patamar de conforto do reservatório, irrigar apenas o talhão mais seco por vez em vez de todos juntos. Entraria como mais uma função no mesmo módulo de regras, avaliada antes da irrigação crítica, sem tocar em transporte nem em interface. Suaviza a queda do reservatório, mas não resolve o déficit descrito no capítulo anterior, que é de dimensionamento.</w:t>
       </w:r>
     </w:p>
     <w:p>

</xml_diff>

<commit_message>
refactor: teste da chuva vira T14 e documento acompanha
Os branches campo e chuva sairam os dois do main e criaram um T13 cada um, o
que o git nao acusa: dariam dois testes com o mesmo numero e uma tabela no
README sem correspondencia com a suite. O da chuva passa a ser T14, porque o do
equilibrio hidrico vem antes na ordem logica das regras, e o codigo diz isso no
comentario que reserva o T13.

O documento ganha a RN13 na tabela de regras, o T14 na tabela de testes e a rota
POST /simulacao/chuva no contrato da API, que estavam so no README.

Co-Authored-By: Claude Opus 5 <noreply@anthropic.com>
</commit_message>
<xml_diff>
--- a/docs/BIOSOLAR HACKUFRA.docx
+++ b/docs/BIOSOLAR HACKUFRA.docx
@@ -5052,6 +5052,89 @@
           </w:p>
         </w:tc>
       </w:tr>
+      <w:tr>
+        <w:tc>
+          <w:tcPr>
+            <w:tcW w:type="dxa" w:w="1400"/>
+            <w:tcMar>
+              <w:top w:type="dxa" w:w="80"/>
+              <w:left w:type="dxa" w:w="120"/>
+              <w:bottom w:type="dxa" w:w="80"/>
+              <w:right w:type="dxa" w:w="120"/>
+            </w:tcMar>
+          </w:tcPr>
+          <w:p>
+            <w:pPr>
+              <w:spacing w:after="0" w:line="280"/>
+            </w:pPr>
+            <w:r>
+              <w:rPr>
+                <w:rFonts w:ascii="Calibri" w:cs="Calibri" w:eastAsia="Calibri" w:hAnsi="Calibri"/>
+                <w:b w:val="false"/>
+                <w:bCs w:val="false"/>
+                <w:color w:val="000000"/>
+                <w:sz w:val="20"/>
+                <w:szCs w:val="20"/>
+              </w:rPr>
+              <w:t xml:space="preserve">RN13</w:t>
+            </w:r>
+          </w:p>
+        </w:tc>
+        <w:tc>
+          <w:tcPr>
+            <w:tcW w:type="dxa" w:w="2600"/>
+            <w:tcMar>
+              <w:top w:type="dxa" w:w="80"/>
+              <w:left w:type="dxa" w:w="120"/>
+              <w:bottom w:type="dxa" w:w="80"/>
+              <w:right w:type="dxa" w:w="120"/>
+            </w:tcMar>
+          </w:tcPr>
+          <w:p>
+            <w:pPr>
+              <w:spacing w:after="0" w:line="280"/>
+            </w:pPr>
+            <w:r>
+              <w:rPr>
+                <w:rFonts w:ascii="Calibri" w:cs="Calibri" w:eastAsia="Calibri" w:hAnsi="Calibri"/>
+                <w:b w:val="false"/>
+                <w:bCs w:val="false"/>
+                <w:color w:val="000000"/>
+                <w:sz w:val="20"/>
+                <w:szCs w:val="20"/>
+              </w:rPr>
+              <w:t xml:space="preserve">Chuva manual</w:t>
+            </w:r>
+          </w:p>
+        </w:tc>
+        <w:tc>
+          <w:tcPr>
+            <w:tcW w:type="dxa" w:w="5000"/>
+            <w:tcMar>
+              <w:top w:type="dxa" w:w="80"/>
+              <w:left w:type="dxa" w:w="120"/>
+              <w:bottom w:type="dxa" w:w="80"/>
+              <w:right w:type="dxa" w:w="120"/>
+            </w:tcMar>
+          </w:tcPr>
+          <w:p>
+            <w:pPr>
+              <w:spacing w:after="0" w:line="280"/>
+            </w:pPr>
+            <w:r>
+              <w:rPr>
+                <w:rFonts w:ascii="Calibri" w:cs="Calibri" w:eastAsia="Calibri" w:hAnsi="Calibri"/>
+                <w:b w:val="false"/>
+                <w:bCs w:val="false"/>
+                <w:color w:val="000000"/>
+                <w:sz w:val="20"/>
+                <w:szCs w:val="20"/>
+              </w:rPr>
+              <w:t xml:space="preserve">Enquanto ligada pelo operador, a umidade de todos os talhões sobe 1,5 por ciclo em vez de secar, taxa menor que a da irrigação, e o reservatório recebe 1,2 por ciclo até o teto de setenta por cento. Nenhuma regra de automação é desligada: a irrigação crítica, o bloqueio e a precedência continuam sendo avaliados normalmente</w:t>
+            </w:r>
+          </w:p>
+        </w:tc>
+      </w:tr>
     </w:tbl>
     <w:p>
       <w:pPr>
@@ -9838,6 +9921,89 @@
                 <w:sz w:val="20"/>
                 <w:szCs w:val="20"/>
               </w:rPr>
+              <w:t xml:space="preserve">POST /simulacao/chuva</w:t>
+            </w:r>
+          </w:p>
+        </w:tc>
+        <w:tc>
+          <w:tcPr>
+            <w:tcW w:type="dxa" w:w="2600"/>
+            <w:tcMar>
+              <w:top w:type="dxa" w:w="80"/>
+              <w:left w:type="dxa" w:w="120"/>
+              <w:bottom w:type="dxa" w:w="80"/>
+              <w:right w:type="dxa" w:w="120"/>
+            </w:tcMar>
+          </w:tcPr>
+          <w:p>
+            <w:pPr>
+              <w:spacing w:after="0" w:line="280"/>
+            </w:pPr>
+            <w:r>
+              <w:rPr>
+                <w:rFonts w:ascii="Calibri" w:cs="Calibri" w:eastAsia="Calibri" w:hAnsi="Calibri"/>
+                <w:b w:val="false"/>
+                <w:bCs w:val="false"/>
+                <w:color w:val="000000"/>
+                <w:sz w:val="20"/>
+                <w:szCs w:val="20"/>
+              </w:rPr>
+              <w:t xml:space="preserve">Liga ou desliga o modo de chuva</w:t>
+            </w:r>
+          </w:p>
+        </w:tc>
+        <w:tc>
+          <w:tcPr>
+            <w:tcW w:type="dxa" w:w="3800"/>
+            <w:tcMar>
+              <w:top w:type="dxa" w:w="80"/>
+              <w:left w:type="dxa" w:w="120"/>
+              <w:bottom w:type="dxa" w:w="80"/>
+              <w:right w:type="dxa" w:w="120"/>
+            </w:tcMar>
+          </w:tcPr>
+          <w:p>
+            <w:pPr>
+              <w:spacing w:after="0" w:line="280"/>
+            </w:pPr>
+            <w:r>
+              <w:rPr>
+                <w:rFonts w:ascii="Calibri" w:cs="Calibri" w:eastAsia="Calibri" w:hAnsi="Calibri"/>
+                <w:b w:val="false"/>
+                <w:bCs w:val="false"/>
+                <w:color w:val="000000"/>
+                <w:sz w:val="20"/>
+                <w:szCs w:val="20"/>
+              </w:rPr>
+              <w:t xml:space="preserve">Estado da fazenda com o novo valor</w:t>
+            </w:r>
+          </w:p>
+        </w:tc>
+      </w:tr>
+      <w:tr>
+        <w:tc>
+          <w:tcPr>
+            <w:tcW w:type="dxa" w:w="2600"/>
+            <w:tcMar>
+              <w:top w:type="dxa" w:w="80"/>
+              <w:left w:type="dxa" w:w="120"/>
+              <w:bottom w:type="dxa" w:w="80"/>
+              <w:right w:type="dxa" w:w="120"/>
+            </w:tcMar>
+          </w:tcPr>
+          <w:p>
+            <w:pPr>
+              <w:spacing w:after="0" w:line="280"/>
+            </w:pPr>
+            <w:r>
+              <w:rPr>
+                <w:rFonts w:ascii="Calibri" w:cs="Calibri" w:eastAsia="Calibri" w:hAnsi="Calibri"/>
+                <w:b w:val="false"/>
+                <w:bCs w:val="false"/>
+                <w:color w:val="000000"/>
+                <w:sz w:val="20"/>
+                <w:szCs w:val="20"/>
+              </w:rPr>
               <w:t xml:space="preserve">WS /stream</w:t>
             </w:r>
           </w:p>
@@ -11440,6 +11606,89 @@
                 <w:szCs w:val="20"/>
               </w:rPr>
               <w:t xml:space="preserve">RN05</w:t>
+            </w:r>
+          </w:p>
+        </w:tc>
+      </w:tr>
+      <w:tr>
+        <w:tc>
+          <w:tcPr>
+            <w:tcW w:type="dxa" w:w="1400"/>
+            <w:tcMar>
+              <w:top w:type="dxa" w:w="80"/>
+              <w:left w:type="dxa" w:w="120"/>
+              <w:bottom w:type="dxa" w:w="80"/>
+              <w:right w:type="dxa" w:w="120"/>
+            </w:tcMar>
+          </w:tcPr>
+          <w:p>
+            <w:pPr>
+              <w:spacing w:after="0" w:line="280"/>
+            </w:pPr>
+            <w:r>
+              <w:rPr>
+                <w:rFonts w:ascii="Calibri" w:cs="Calibri" w:eastAsia="Calibri" w:hAnsi="Calibri"/>
+                <w:b w:val="false"/>
+                <w:bCs w:val="false"/>
+                <w:color w:val="000000"/>
+                <w:sz w:val="20"/>
+                <w:szCs w:val="20"/>
+              </w:rPr>
+              <w:t xml:space="preserve">T14</w:t>
+            </w:r>
+          </w:p>
+        </w:tc>
+        <w:tc>
+          <w:tcPr>
+            <w:tcW w:type="dxa" w:w="4000"/>
+            <w:tcMar>
+              <w:top w:type="dxa" w:w="80"/>
+              <w:left w:type="dxa" w:w="120"/>
+              <w:bottom w:type="dxa" w:w="80"/>
+              <w:right w:type="dxa" w:w="120"/>
+            </w:tcMar>
+          </w:tcPr>
+          <w:p>
+            <w:pPr>
+              <w:spacing w:after="0" w:line="280"/>
+            </w:pPr>
+            <w:r>
+              <w:rPr>
+                <w:rFonts w:ascii="Calibri" w:cs="Calibri" w:eastAsia="Calibri" w:hAnsi="Calibri"/>
+                <w:b w:val="false"/>
+                <w:bCs w:val="false"/>
+                <w:color w:val="000000"/>
+                <w:sz w:val="20"/>
+                <w:szCs w:val="20"/>
+              </w:rPr>
+              <w:t xml:space="preserve">Durante a chuva o solo sobe sem bomba ligada, o reservatório respeita o teto, e a irrigação crítica continua sendo acionada se um talhão cruzar o gatilho mesmo assim</w:t>
+            </w:r>
+          </w:p>
+        </w:tc>
+        <w:tc>
+          <w:tcPr>
+            <w:tcW w:type="dxa" w:w="3600"/>
+            <w:tcMar>
+              <w:top w:type="dxa" w:w="80"/>
+              <w:left w:type="dxa" w:w="120"/>
+              <w:bottom w:type="dxa" w:w="80"/>
+              <w:right w:type="dxa" w:w="120"/>
+            </w:tcMar>
+          </w:tcPr>
+          <w:p>
+            <w:pPr>
+              <w:spacing w:after="0" w:line="280"/>
+            </w:pPr>
+            <w:r>
+              <w:rPr>
+                <w:rFonts w:ascii="Calibri" w:cs="Calibri" w:eastAsia="Calibri" w:hAnsi="Calibri"/>
+                <w:b w:val="false"/>
+                <w:bCs w:val="false"/>
+                <w:color w:val="000000"/>
+                <w:sz w:val="20"/>
+                <w:szCs w:val="20"/>
+              </w:rPr>
+              <w:t xml:space="preserve">RN13</w:t>
             </w:r>
           </w:p>
         </w:tc>

</xml_diff>